<commit_message>
docs: update SRS/SDS docs, feature analyses, and diagram assets
Reorganize doc_final/Guides templates and refresh SDS/SRS release docs
and feature-flow analyses ahead of merging branch_for_hung.

Co-Authored-By: Claude Sonnet 5 <noreply@anthropic.com>
</commit_message>
<xml_diff>
--- a/docs/01-SRS-Requirements/SRS-Japanese-Skill-Practice-Platform.en.docx
+++ b/docs/01-SRS-Requirements/SRS-Japanese-Skill-Practice-Platform.en.docx
@@ -491,7 +491,7 @@
       <w:r>
         <w:drawing>
           <wp:inline xmlns:a="http://schemas.openxmlformats.org/drawingml/2006/main" xmlns:pic="http://schemas.openxmlformats.org/drawingml/2006/picture">
-            <wp:extent cx="5669280" cy="2232279"/>
+            <wp:extent cx="5669280" cy="2459050"/>
             <wp:docPr id="2" name="Picture 2"/>
             <wp:cNvGraphicFramePr>
               <a:graphicFrameLocks noChangeAspect="1"/>
@@ -512,7 +512,7 @@
                   <pic:spPr>
                     <a:xfrm>
                       <a:off x="0" y="0"/>
-                      <a:ext cx="5669280" cy="2232279"/>
+                      <a:ext cx="5669280" cy="2459050"/>
                     </a:xfrm>
                     <a:prstGeom prst="rect"/>
                   </pic:spPr>
@@ -4375,7 +4375,7 @@
       <w:r>
         <w:drawing>
           <wp:inline xmlns:a="http://schemas.openxmlformats.org/drawingml/2006/main" xmlns:pic="http://schemas.openxmlformats.org/drawingml/2006/picture">
-            <wp:extent cx="5669280" cy="2062201"/>
+            <wp:extent cx="5669280" cy="1889204"/>
             <wp:docPr id="15" name="Picture 15"/>
             <wp:cNvGraphicFramePr>
               <a:graphicFrameLocks noChangeAspect="1"/>
@@ -4396,7 +4396,7 @@
                   <pic:spPr>
                     <a:xfrm>
                       <a:off x="0" y="0"/>
-                      <a:ext cx="5669280" cy="2062201"/>
+                      <a:ext cx="5669280" cy="1889204"/>
                     </a:xfrm>
                     <a:prstGeom prst="rect"/>
                   </pic:spPr>

</xml_diff>